<commit_message>
docs: reorganize project documentation and brand assets
</commit_message>
<xml_diff>
--- a/docs/technical-assignment-contract-appendix-forum.docx
+++ b/docs/technical-assignment-contract-appendix-forum.docx
@@ -242,15 +242,8 @@
             </w:tcMar>
           </w:tcPr>
           <w:p>
-            <w:pPr>
-              <w:spacing w:after="0" w:line="264" w:lineRule="auto"/>
-            </w:pPr>
             <w:r>
-              <w:rPr>
-                <w:rFonts w:ascii="Calibri" w:hAnsi="Calibri" w:eastAsia="Calibri" w:cs="Calibri"/>
-                <w:sz w:val="20"/>
-              </w:rPr>
-              <w:t>1.0</w:t>
+              <w:t>1.2</w:t>
             </w:r>
           </w:p>
         </w:tc>
@@ -292,15 +285,8 @@
             </w:tcMar>
           </w:tcPr>
           <w:p>
-            <w:pPr>
-              <w:spacing w:after="0" w:line="264" w:lineRule="auto"/>
-            </w:pPr>
             <w:r>
-              <w:rPr>
-                <w:rFonts w:ascii="Calibri" w:hAnsi="Calibri" w:eastAsia="Calibri" w:cs="Calibri"/>
-                <w:sz w:val="20"/>
-              </w:rPr>
-              <w:t>24.07.2026</w:t>
+              <w:t>14.08.2026</w:t>
             </w:r>
           </w:p>
         </w:tc>
@@ -714,7 +700,7 @@
         <w:rPr>
           <w:rFonts w:ascii="Calibri" w:hAnsi="Calibri" w:eastAsia="Calibri" w:cs="Calibri"/>
         </w:rPr>
-        <w:t>MVP должен обеспечить доверенный закрытый процесс: импорт строительной сметы, разбиение потребностей на модерируемые лоты, показ лотов только подходящим верифицированным исполнителям, сбор структурированных предложений, выбор победителей, раскрытие контактов по правилам и формирование пакета сделки.</w:t>
+        <w:t>MVP должен обеспечить доверенный закрытый процесс: регистрация только после успешной внешней идентификации участника, импорт строительной сметы, разбиение потребностей на модерируемые лоты, показ лотов только подходящим зарегистрированным исполнителям, сбор структурированных предложений, выбор победителей, раскрытие контактов по правилам и формирование пакета сделки.</w:t>
       </w:r>
     </w:p>
     <w:p>
@@ -930,7 +916,7 @@
                 <w:rFonts w:ascii="Calibri" w:hAnsi="Calibri" w:eastAsia="Calibri" w:cs="Calibri"/>
                 <w:sz w:val="20"/>
               </w:rPr>
-              <w:t>Юридическое лицо, ИП или физическое лицо, проходящее верификацию, заполняющее профиль предложений, просматривающее доступные лоты и отправляющее структурированные предложения. Физические лица работают только с сервисными лотами.</w:t>
+              <w:t>Юридическое лицо, ИП или физическое лицо, зарегистрированное после успешной идентификации через Сбер ID или Контур.Диадок, заполняющее профиль предложений, просматривающее доступные лоты и отправляющее структурированные предложения. Физические лица работают только с сервисными лотами.</w:t>
             </w:r>
           </w:p>
         </w:tc>
@@ -980,7 +966,7 @@
                 <w:rFonts w:ascii="Calibri" w:hAnsi="Calibri" w:eastAsia="Calibri" w:cs="Calibri"/>
                 <w:sz w:val="20"/>
               </w:rPr>
-              <w:t>Сотрудник платформы, проверяющий участников, лоты, отзывы и ответы на отзывы, а также управляющий шаблонами предложений по категориям.</w:t>
+              <w:t>Сотрудник платформы, проверяющий лоты, отзывы и ответы на отзывы, а также управляющий шаблонами предложений по категориям. Модератор не рассматривает регистрацию участников.</w:t>
             </w:r>
           </w:p>
         </w:tc>
@@ -1079,7 +1065,7 @@
         <w:rPr>
           <w:rFonts w:ascii="Calibri" w:hAnsi="Calibri" w:eastAsia="Calibri" w:cs="Calibri"/>
         </w:rPr>
-        <w:t>Система должна содержать публичные страницы: главная, раздельная регистрация заказчика и исполнителя, вход, восстановление пароля, подтверждение email, пользовательское соглашение, политика конфиденциальности и контакты.</w:t>
+        <w:t>Система должна содержать публичные страницы: главная, раздельная регистрация заказчика и исполнителя, вход через Сбер ID или Контур.Диадок, подтверждение email, пользовательское соглашение, политика конфиденциальности и контакты.</w:t>
       </w:r>
     </w:p>
     <w:p>
@@ -1112,7 +1098,7 @@
         <w:rPr>
           <w:rFonts w:ascii="Calibri" w:hAnsi="Calibri" w:eastAsia="Calibri" w:cs="Calibri"/>
         </w:rPr>
-        <w:t>Система должна требовать подтверждения email и поддерживать восстановление пароля через подтвержденный email.</w:t>
+        <w:t>Система должна требовать подтверждения email. Для участников вход и восстановление доступа выполняются через Сбер ID или Контур.Диадок; локальный пароль участника в Системе не создается и не хранится.</w:t>
       </w:r>
     </w:p>
     <w:p>
@@ -1142,7 +1128,7 @@
         <w:pStyle w:val="Heading2"/>
       </w:pPr>
       <w:r>
-        <w:t>3.2. Верификация и модерация</w:t>
+        <w:t>3.2. Внешняя идентификация и модерация контента</w:t>
       </w:r>
     </w:p>
     <w:p>
@@ -1153,7 +1139,7 @@
         <w:rPr>
           <w:rFonts w:ascii="Calibri" w:hAnsi="Calibri" w:eastAsia="Calibri" w:cs="Calibri"/>
         </w:rPr>
-        <w:t>Заказчики и исполнители должны проходить ручную верификацию модератором до доступа к ключевой функциональности.</w:t>
+        <w:t>Аккаунт физического лица должен создаваться только после успешной идентификации через Сбер ID. Аккаунт юридического лица или ИП должен создаваться только после успешной идентификации пользователя и организации через Контур.Диадок. Ручная верификация или модерация регистрации заказчиков и исполнителей на площадке не выполняется; внутренний статус верификации участника не создается. После успешной регистрации участник получает доступ к функциям своей роли без дополнительного решения модератора.</w:t>
       </w:r>
     </w:p>
     <w:p>
@@ -1186,7 +1172,7 @@
         <w:rPr>
           <w:rFonts w:ascii="Calibri" w:hAnsi="Calibri" w:eastAsia="Calibri" w:cs="Calibri"/>
         </w:rPr>
-        <w:t>Отклонение участника, лота, отзыва или ответа должно содержать причину из справочника и комментарий модератора.</w:t>
+        <w:t>Отклонение лота, отзыва или ответа должно содержать причину из справочника и комментарий модератора.</w:t>
       </w:r>
     </w:p>
     <w:p>
@@ -1707,7 +1693,7 @@
         <w:rPr>
           <w:rFonts w:ascii="Calibri" w:hAnsi="Calibri" w:eastAsia="Calibri" w:cs="Calibri"/>
         </w:rPr>
-        <w:t>Кабинеты модератора и администратора должны показывать очереди и операционные метрики: верификации, модерации, опубликованные и открытые лоты, предложения, лоты без предложений, зарегистрированные участники, исполнители по категориям и среднее время модерации.</w:t>
+        <w:t>Кабинеты модератора и администратора должны показывать очереди и операционные метрики: лоты, отзывы и ответы на модерации, опубликованные и открытые лоты, предложения, лоты без предложений, зарегистрированные участники, исполнители по категориям и среднее время модерации контента.</w:t>
       </w:r>
     </w:p>
     <w:p>
@@ -2181,7 +2167,7 @@
         <w:rPr>
           <w:rFonts w:ascii="Calibri" w:hAnsi="Calibri" w:eastAsia="Calibri" w:cs="Calibri"/>
         </w:rPr>
-        <w:t>Система должна вести аудит ключевых действий: верификация, модерация, публикация и отклонение лотов, изменение лотов, отправка предложений, выбор победителя, раскрытие контактов, подтверждение сделки, отзывы, ответы, ограничения участников и деактивация пользователей.</w:t>
+        <w:t>Система должна вести аудит ключевых действий: внешняя идентификация и регистрация, модерация, публикация и отклонение лотов, изменение лотов, отправка предложений, выбор победителя, раскрытие контактов, подтверждение сделки, отзывы, ответы, ограничения участников и деактивация пользователей.</w:t>
       </w:r>
     </w:p>
     <w:p>
@@ -2244,7 +2230,7 @@
         <w:rPr>
           <w:rFonts w:ascii="Calibri" w:hAnsi="Calibri" w:eastAsia="Calibri" w:cs="Calibri"/>
         </w:rPr>
-        <w:t>Пароли должны храниться только в виде безопасных хешей с современными параметрами.</w:t>
+        <w:t>Локальные пароли допускаются только для вручную созданных учетных записей команды платформы и должны храниться в виде безопасных хешей с современными параметрами. Для учетных записей участников локальные пароли не используются.</w:t>
       </w:r>
     </w:p>
     <w:p>
@@ -2255,7 +2241,7 @@
         <w:rPr>
           <w:rFonts w:ascii="Calibri" w:hAnsi="Calibri" w:eastAsia="Calibri" w:cs="Calibri"/>
         </w:rPr>
-        <w:t>Сессии должны быть защищены и должны проверять роль, организацию и статус верификации на каждом защищенном действии.</w:t>
+        <w:t>Сессии должны быть защищены и должны проверять роль, организацию и операционное состояние доступа участника на каждом защищенном действии.</w:t>
       </w:r>
     </w:p>
     <w:p>
@@ -2414,7 +2400,7 @@
         <w:rPr>
           <w:rFonts w:ascii="Calibri" w:hAnsi="Calibri" w:eastAsia="Calibri" w:cs="Calibri"/>
         </w:rPr>
-        <w:t>интеграции с 1С, CRM, государственными закупочными площадками, внешними юридическими сервисами и банковскими сервисами;</w:t>
+        <w:t>интеграции с 1С, CRM, государственными закупочными площадками, внешними юридическими сервисами и банковскими сервисами, кроме Сбер ID и Контур.Диадок для регистрации и авторизации;</w:t>
       </w:r>
     </w:p>
     <w:p>
@@ -3106,7 +3092,7 @@
                 <w:rFonts w:ascii="Calibri" w:hAnsi="Calibri" w:eastAsia="Calibri" w:cs="Calibri"/>
                 <w:sz w:val="20"/>
               </w:rPr>
-              <w:t>Доменная логика, статусы, роли, пароли, файлы, сопоставление, ограничения предложений, отзывы и аналитические расчеты.</w:t>
+              <w:t>Доменная логика, статусы, роли, внешняя авторизация, сессии, локальные учетные данные команды платформы, файлы, сопоставление, ограничения предложений, отзывы и аналитические расчеты.</w:t>
             </w:r>
           </w:p>
         </w:tc>
@@ -3156,7 +3142,7 @@
                 <w:rFonts w:ascii="Calibri" w:hAnsi="Calibri" w:eastAsia="Calibri" w:cs="Calibri"/>
                 <w:sz w:val="20"/>
               </w:rPr>
-              <w:t>Регистрация, верификация, импорт сметы, модерация лотов, публикация, видимость, предложения, комментарии, выбор победителя и раскрытие контактов.</w:t>
+              <w:t>Регистрация через Сбер ID и Контур.Диадок без ручной проверки участника, импорт сметы, модерация лотов, публикация, видимость, предложения, комментарии, выбор победителя и раскрытие контактов.</w:t>
             </w:r>
           </w:p>
         </w:tc>
@@ -3328,7 +3314,7 @@
         <w:rPr>
           <w:rFonts w:ascii="Calibri" w:hAnsi="Calibri" w:eastAsia="Calibri" w:cs="Calibri"/>
         </w:rPr>
-        <w:t>Пользователь-заказчик регистрируется, подтверждает email, проходит модерацию и получает доступ к кабинету.</w:t>
+        <w:t>Пользователь-заказчик успешно идентифицируется через Контур.Диадок, регистрируется и получает доступ к кабинету без ручного решения модератора.</w:t>
       </w:r>
     </w:p>
     <w:p>
@@ -3339,7 +3325,18 @@
         <w:rPr>
           <w:rFonts w:ascii="Calibri" w:hAnsi="Calibri" w:eastAsia="Calibri" w:cs="Calibri"/>
         </w:rPr>
-        <w:t>Исполнитель регистрируется, заполняет профиль предложений, проходит модерацию и видит только подходящие лоты.</w:t>
+        <w:t>Исполнитель успешно идентифицируется через Сбер ID либо Контур.Диадок, регистрируется, заполняет профиль предложений и видит только подходящие лоты без ручной модерации регистрации.</w:t>
+      </w:r>
+    </w:p>
+    <w:p>
+      <w:pPr>
+        <w:pStyle w:val="ListNumber"/>
+      </w:pPr>
+      <w:r>
+        <w:rPr>
+          <w:rFonts w:ascii="Calibri" w:hAnsi="Calibri" w:eastAsia="Calibri" w:cs="Calibri"/>
+        </w:rPr>
+        <w:t>Участник, утративший доступ, восстанавливает его через соответствующего внешнего провайдера; Система не выдает участнику ссылку для сброса локального пароля.</w:t>
       </w:r>
     </w:p>
     <w:p>
@@ -3903,7 +3900,7 @@
         <w:rPr>
           <w:rFonts w:ascii="Calibri" w:hAnsi="Calibri" w:eastAsia="Calibri" w:cs="Calibri"/>
         </w:rPr>
-        <w:t>доступы и учетные данные к инфраструктуре, домену, email-провайдеру, Telegram-боту, MAX-каналу и объектному хранилищу, если они используются в согласованном окружении;</w:t>
+        <w:t>доступы и учетные данные к Сбер ID, Контур.Диадок, инфраструктуре, домену, email-провайдеру, Telegram-боту, MAX-каналу и объектному хранилищу, если они используются в согласованном окружении;</w:t>
       </w:r>
     </w:p>
     <w:p>
@@ -4174,7 +4171,7 @@
                 <w:rFonts w:ascii="Calibri" w:hAnsi="Calibri" w:eastAsia="Calibri" w:cs="Calibri"/>
                 <w:sz w:val="20"/>
               </w:rPr>
-              <w:t>Регистрация, email, пароль, организации, администраторы, приглашения и деактивация.</w:t>
+              <w:t>Регистрация, вход и восстановление доступа через Сбер ID или Контур.Диадок, email, организации, администраторы, приглашения и деактивация.</w:t>
             </w:r>
           </w:p>
         </w:tc>
@@ -4198,7 +4195,7 @@
                 <w:rFonts w:ascii="Calibri" w:hAnsi="Calibri" w:eastAsia="Calibri" w:cs="Calibri"/>
                 <w:sz w:val="20"/>
               </w:rPr>
-              <w:t>Сценарии регистрации и приглашений проходят; неавторизованный доступ запрещен.</w:t>
+              <w:t>Аккаунт создается только после успешной внешней идентификации; участник входит и восстанавливает доступ через внешнего провайдера; локальный пароль участника отсутствует.</w:t>
             </w:r>
           </w:p>
         </w:tc>
@@ -4248,7 +4245,7 @@
                 <w:rFonts w:ascii="Calibri" w:hAnsi="Calibri" w:eastAsia="Calibri" w:cs="Calibri"/>
                 <w:sz w:val="20"/>
               </w:rPr>
-              <w:t>Ручная верификация заказчиков и исполнителей.</w:t>
+              <w:t>Отсутствие ручной верификации и модерации регистрации участников.</w:t>
             </w:r>
           </w:p>
         </w:tc>
@@ -4272,7 +4269,7 @@
                 <w:rFonts w:ascii="Calibri" w:hAnsi="Calibri" w:eastAsia="Calibri" w:cs="Calibri"/>
                 <w:sz w:val="20"/>
               </w:rPr>
-              <w:t>Без модерации участник не получает доступ к рабочим сценариям.</w:t>
+              <w:t>После успешной регистрации участник получает доступ к функциям своей роли без решения модератора; внутреннего статуса верификации нет.</w:t>
             </w:r>
           </w:p>
         </w:tc>
@@ -6460,7 +6457,7 @@
                 <w:rFonts w:ascii="Calibri" w:hAnsi="Calibri" w:eastAsia="Calibri" w:cs="Calibri"/>
                 <w:sz w:val="20"/>
               </w:rPr>
-              <w:t>Регистрация, email, пароль, роли, организации, приглашения, деактивация и серверные политики доступа.</w:t>
+              <w:t>Регистрация, вход и восстановление доступа через Сбер ID и Контур.Диадок, email, роли, организации, приглашения, деактивация и серверные политики доступа.</w:t>
             </w:r>
           </w:p>
         </w:tc>
@@ -6584,7 +6581,7 @@
                 <w:rFonts w:ascii="Calibri" w:hAnsi="Calibri" w:eastAsia="Calibri" w:cs="Calibri"/>
                 <w:sz w:val="20"/>
               </w:rPr>
-              <w:t>Верификация, модерация, справочники и шаблоны предложений</w:t>
+              <w:t>Модерация контента, справочники и шаблоны предложений</w:t>
             </w:r>
           </w:p>
         </w:tc>
@@ -6608,7 +6605,7 @@
                 <w:rFonts w:ascii="Calibri" w:hAnsi="Calibri" w:eastAsia="Calibri" w:cs="Calibri"/>
                 <w:sz w:val="20"/>
               </w:rPr>
-              <w:t>Верификация, модерация, справочники, причины отклонения и шаблоны предложений.</w:t>
+              <w:t>Модерация лотов, отзывов и ответов, справочники, причины отклонения и шаблоны предложений.</w:t>
             </w:r>
           </w:p>
         </w:tc>
@@ -7684,7 +7681,7 @@
                 <w:rFonts w:ascii="Calibri" w:hAnsi="Calibri" w:eastAsia="Calibri" w:cs="Calibri"/>
                 <w:sz w:val="20"/>
               </w:rPr>
-              <w:t>Сотрудник платформы, выполняющий ручные проверки участников, лотов, отзывов и шаблонов.</w:t>
+              <w:t>Сотрудник платформы, выполняющий ручную модерацию лотов, отзывов, ответов и шаблонов; регистрацию участников не рассматривает.</w:t>
             </w:r>
           </w:p>
         </w:tc>

</xml_diff>